<commit_message>
docs(HW2): Update submission document with structured tasks, prompts, and screenshot placeholders
</commit_message>
<xml_diff>
--- a/HW2/hw2-Z23815316.docx
+++ b/HW2/hw2-Z23815316.docx
@@ -423,69 +423,515 @@
     </w:p>
     <w:p>
       <w:pPr>
-        <w:pStyle w:val="BodyText"/>
-        <w:bidi w:val="0"/>
-        <w:jc w:val="start"/>
-        <w:rPr>
-          <w:b w:val="false"/>
-          <w:bCs w:val="false"/>
-          <w:i/>
-          <w:i/>
-          <w:iCs/>
-        </w:rPr>
-      </w:pPr>
-      <w:r>
-        <w:rPr>
-          <w:b w:val="false"/>
-          <w:bCs w:val="false"/>
-          <w:i/>
-          <w:iCs/>
-        </w:rPr>
-      </w:r>
-    </w:p>
-    <w:p>
-      <w:pPr>
-        <w:pStyle w:val="BodyText"/>
-        <w:bidi w:val="0"/>
-        <w:spacing w:before="0" w:after="140"/>
-        <w:jc w:val="start"/>
-        <w:rPr/>
-      </w:pPr>
-      <w:r>
-        <w:rPr>
-          <w:b w:val="false"/>
-          <w:bCs w:val="false"/>
-          <w:i/>
-          <w:iCs/>
-        </w:rPr>
-        <w:t>Repeat for each step:</w:t>
-      </w:r>
-    </w:p>
-    <w:p>
-      <w:pPr>
-        <w:pStyle w:val="BodyText"/>
-        <w:bidi w:val="0"/>
-        <w:spacing w:before="0" w:after="140"/>
-        <w:jc w:val="start"/>
-        <w:rPr/>
-      </w:pPr>
-      <w:r>
-        <w:rPr>
-          <w:b w:val="false"/>
-          <w:bCs w:val="false"/>
-          <w:i/>
-          <w:iCs/>
-        </w:rPr>
-        <w:t xml:space="preserve">… </w:t>
-      </w:r>
-      <w:r>
-        <w:rPr>
-          <w:b w:val="false"/>
-          <w:bCs w:val="false"/>
-          <w:i/>
-          <w:iCs/>
-        </w:rPr>
-        <w:t>paste here the screenshots and task prompts ...</w:t>
+        <w:pStyle w:val="Heading3"/>
+        <w:spacing w:before="280" w:after="80"/>
+      </w:pPr>
+      <w:r>
+        <w:t>Task 1: Project Setup and Repository Infrastructure</w:t>
+      </w:r>
+    </w:p>
+    <w:p>
+      <w:r>
+        <w:rPr>
+          <w:b/>
+        </w:rPr>
+        <w:t>Task Prompt Given to the Agent:</w:t>
+      </w:r>
+    </w:p>
+    <w:p>
+      <w:pPr>
+        <w:spacing w:after="80"/>
+        <w:ind w:left="360"/>
+      </w:pPr>
+      <w:r>
+        <w:t>Configure a dedicated HW2 directory within the gensec-code repository with virtual environment isolation, .gitignore rules for vector databases (.chromadb) and caches, and install all required LangChain, ChromaDB, and Google Vertex AI dependencies.</w:t>
+      </w:r>
+    </w:p>
+    <w:p>
+      <w:r>
+        <w:rPr>
+          <w:b/>
+        </w:rPr>
+        <w:t>Agent Response Summary:</w:t>
+      </w:r>
+    </w:p>
+    <w:p>
+      <w:pPr>
+        <w:spacing w:after="80"/>
+        <w:ind w:left="360"/>
+      </w:pPr>
+      <w:r>
+        <w:t>Initialized the HW2 package structure. Configured requirements.txt with langchain, langchain-chroma, langchain-google-vertexai, and document loaders. Set up .gitignore to prevent local database artifacts and system files from being committed.</w:t>
+      </w:r>
+    </w:p>
+    <w:p>
+      <w:r>
+        <w:rPr>
+          <w:b/>
+        </w:rPr>
+        <w:t>Generated / Modified Code:</w:t>
+      </w:r>
+    </w:p>
+    <w:p>
+      <w:pPr>
+        <w:ind w:left="360"/>
+      </w:pPr>
+      <w:r>
+        <w:t>Top lines of HW2/requirements.txt and environment configuration:</w:t>
+      </w:r>
+    </w:p>
+    <w:p>
+      <w:pPr>
+        <w:spacing w:after="120"/>
+        <w:ind w:left="720"/>
+      </w:pPr>
+      <w:r>
+        <w:rPr>
+          <w:rFonts w:ascii="Courier New" w:hAnsi="Courier New"/>
+          <w:sz w:val="19"/>
+        </w:rPr>
+        <w:t>langchain</w:t>
+        <w:br/>
+        <w:t>chainlit</w:t>
+        <w:br/>
+        <w:t>langchain-chroma</w:t>
+        <w:br/>
+        <w:t>langchain-google-vertexai</w:t>
+        <w:br/>
+        <w:t>google-cloud-aiplatform</w:t>
+        <w:br/>
+        <w:t>pypdf</w:t>
+        <w:br/>
+        <w:t>docx2txt</w:t>
+        <w:br/>
+        <w:t>markdown</w:t>
+      </w:r>
+    </w:p>
+    <w:p>
+      <w:r>
+        <w:rPr>
+          <w:b/>
+        </w:rPr>
+        <w:t>Screenshot 1: Task Prompt &amp; Agent Response</w:t>
+      </w:r>
+    </w:p>
+    <w:p>
+      <w:pPr>
+        <w:spacing w:after="120"/>
+        <w:ind w:left="360"/>
+      </w:pPr>
+      <w:r>
+        <w:t>[Screenshot 1.1: VSCode window showing agent prompt &amp; response for repository and dependency setup with FAU ID Z23815316 visible]</w:t>
+        <w:br/>
+        <w:t>[Paste Image Here]</w:t>
+      </w:r>
+    </w:p>
+    <w:p>
+      <w:r>
+        <w:rPr>
+          <w:b/>
+        </w:rPr>
+        <w:t>Screenshot 2: Code Implementation / Execution</w:t>
+      </w:r>
+    </w:p>
+    <w:p>
+      <w:pPr>
+        <w:spacing w:after="240"/>
+        <w:ind w:left="360"/>
+      </w:pPr>
+      <w:r>
+        <w:t>[Screenshot 1.2: VSCode window showing project files and requirements.txt with FAU ID Z23815316 visible]</w:t>
+        <w:br/>
+        <w:t>[Paste Image Here]</w:t>
+      </w:r>
+    </w:p>
+    <w:p>
+      <w:pPr>
+        <w:pStyle w:val="Heading3"/>
+        <w:spacing w:before="280" w:after="80"/>
+      </w:pPr>
+      <w:r>
+        <w:t>Task 2: Feature 1 — Custom Document Loader (ResearchNoteLoader)</w:t>
+      </w:r>
+    </w:p>
+    <w:p>
+      <w:r>
+        <w:rPr>
+          <w:b/>
+        </w:rPr>
+        <w:t>Task Prompt Given to the Agent:</w:t>
+      </w:r>
+    </w:p>
+    <w:p>
+      <w:pPr>
+        <w:spacing w:after="80"/>
+        <w:ind w:left="360"/>
+      </w:pPr>
+      <w:r>
+        <w:t>Create a custom LangChain document loader extending BaseLoader that loads and parses both structured JSON datasets (tables, economic data, airport directories) and Markdown research notes containing YAML frontmatter metadata (title, author, topic, tags, date). Include unit tests.</w:t>
+      </w:r>
+    </w:p>
+    <w:p>
+      <w:r>
+        <w:rPr>
+          <w:b/>
+        </w:rPr>
+        <w:t>Agent Response Summary:</w:t>
+      </w:r>
+    </w:p>
+    <w:p>
+      <w:pPr>
+        <w:spacing w:after="80"/>
+        <w:ind w:left="360"/>
+      </w:pPr>
+      <w:r>
+        <w:t>Implemented ResearchNoteLoader in notebook_loader.py extending langchain_core.document_loaders.BaseLoader. Added regex frontmatter extraction and structured JSON record parsing. Created test_notebook_loader.py with automated unit tests verifying frontmatter metadata extraction, directory batch loading, and JSON table conversion.</w:t>
+      </w:r>
+    </w:p>
+    <w:p>
+      <w:r>
+        <w:rPr>
+          <w:b/>
+        </w:rPr>
+        <w:t>Generated / Modified Code:</w:t>
+      </w:r>
+    </w:p>
+    <w:p>
+      <w:pPr>
+        <w:ind w:left="360"/>
+      </w:pPr>
+      <w:r>
+        <w:t>Top lines of HW2/notebook_loader.py:</w:t>
+      </w:r>
+    </w:p>
+    <w:p>
+      <w:pPr>
+        <w:spacing w:after="120"/>
+        <w:ind w:left="720"/>
+      </w:pPr>
+      <w:r>
+        <w:rPr>
+          <w:rFonts w:ascii="Courier New" w:hAnsi="Courier New"/>
+          <w:sz w:val="19"/>
+        </w:rPr>
+        <w:t>from __future__ import annotations</w:t>
+        <w:br/>
+        <w:t>import json, os, re</w:t>
+        <w:br/>
+        <w:t>from pathlib import Path</w:t>
+        <w:br/>
+        <w:t>from typing import Any, Dict, Iterator, List, Optional, Union</w:t>
+        <w:br/>
+        <w:t>from langchain_core.document_loaders import BaseLoader</w:t>
+        <w:br/>
+        <w:t>from langchain_core.documents import Document</w:t>
+        <w:br/>
+        <w:br/>
+        <w:t>class ResearchNoteLoader(BaseLoader):</w:t>
+        <w:br/>
+        <w:t xml:space="preserve">    """Loader for structured research notes and JSON study documents."""</w:t>
+        <w:br/>
+        <w:t xml:space="preserve">    def __init__(self, file_path: Union[str, Path], glob_pattern: str = "**/*.[mM][dD]", encoding: str = "utf-8"):</w:t>
+      </w:r>
+    </w:p>
+    <w:p>
+      <w:r>
+        <w:rPr>
+          <w:b/>
+        </w:rPr>
+        <w:t>Screenshot 1: Task Prompt &amp; Agent Response</w:t>
+      </w:r>
+    </w:p>
+    <w:p>
+      <w:pPr>
+        <w:spacing w:after="120"/>
+        <w:ind w:left="360"/>
+      </w:pPr>
+      <w:r>
+        <w:t>[Screenshot 2.1: VSCode window showing agent prompt &amp; response for custom loader implementation with FAU ID Z23815316 visible]</w:t>
+        <w:br/>
+        <w:t>[Paste Image Here]</w:t>
+      </w:r>
+    </w:p>
+    <w:p>
+      <w:r>
+        <w:rPr>
+          <w:b/>
+        </w:rPr>
+        <w:t>Screenshot 2: Code Implementation / Execution</w:t>
+      </w:r>
+    </w:p>
+    <w:p>
+      <w:pPr>
+        <w:spacing w:after="240"/>
+        <w:ind w:left="360"/>
+      </w:pPr>
+      <w:r>
+        <w:t>[Screenshot 2.2: VSCode window showing notebook_loader.py and passing test execution with FAU ID Z23815316 visible]</w:t>
+        <w:br/>
+        <w:t>[Paste Image Here]</w:t>
+      </w:r>
+    </w:p>
+    <w:p>
+      <w:pPr>
+        <w:pStyle w:val="Heading3"/>
+        <w:spacing w:before="280" w:after="80"/>
+      </w:pPr>
+      <w:r>
+        <w:t>Task 3: Feature 2 — Grounded Q&amp;A with Strict In-Line Citations</w:t>
+      </w:r>
+    </w:p>
+    <w:p>
+      <w:r>
+        <w:rPr>
+          <w:b/>
+        </w:rPr>
+        <w:t>Task Prompt Given to the Agent:</w:t>
+      </w:r>
+    </w:p>
+    <w:p>
+      <w:pPr>
+        <w:spacing w:after="80"/>
+        <w:ind w:left="360"/>
+      </w:pPr>
+      <w:r>
+        <w:t>Implement a NotebookLM-style question-answering architecture that strictly grounds responses in retrieved document passages, appends in-line citations [Source: filename] to every claim, and provides a verified list of cited sources.</w:t>
+      </w:r>
+    </w:p>
+    <w:p>
+      <w:r>
+        <w:rPr>
+          <w:b/>
+        </w:rPr>
+        <w:t>Agent Response Summary:</w:t>
+      </w:r>
+    </w:p>
+    <w:p>
+      <w:pPr>
+        <w:spacing w:after="80"/>
+        <w:ind w:left="360"/>
+      </w:pPr>
+      <w:r>
+        <w:t>Implemented NotebookRAGService in app.py. Designed a grounded prompt template that enforces fact retrieval strictly from context chunks, formats every claim with [Source: filename], and extracts unique cited sources. Added resilient Chroma vectorstore imports with fallback.</w:t>
+      </w:r>
+    </w:p>
+    <w:p>
+      <w:r>
+        <w:rPr>
+          <w:b/>
+        </w:rPr>
+        <w:t>Generated / Modified Code:</w:t>
+      </w:r>
+    </w:p>
+    <w:p>
+      <w:pPr>
+        <w:ind w:left="360"/>
+      </w:pPr>
+      <w:r>
+        <w:t>Top lines of Feature 2 citation logic in HW2/app.py:</w:t>
+      </w:r>
+    </w:p>
+    <w:p>
+      <w:pPr>
+        <w:spacing w:after="120"/>
+        <w:ind w:left="720"/>
+      </w:pPr>
+      <w:r>
+        <w:rPr>
+          <w:rFonts w:ascii="Courier New" w:hAnsi="Courier New"/>
+          <w:sz w:val="19"/>
+        </w:rPr>
+        <w:t>self.qa_prompt = ChatPromptTemplate.from_template(</w:t>
+        <w:br/>
+        <w:t xml:space="preserve">    """You are SmartNotebook, an expert AI research assistant inspired by NotebookLM.</w:t>
+        <w:br/>
+        <w:t>Answer the user's question STRICTLY based on the provided context passages below.</w:t>
+        <w:br/>
+        <w:t>For every claim or factual point you make, cite the corresponding source in brackets</w:t>
+        <w:br/>
+        <w:t>(e.g. [Source: filename or title]). If the answer cannot be found in the context,</w:t>
+        <w:br/>
+        <w:t>state clearly that the provided documents do not contain this information.</w:t>
+        <w:br/>
+        <w:br/>
+        <w:t>Context:</w:t>
+        <w:br/>
+        <w:t>{context}</w:t>
+        <w:br/>
+        <w:br/>
+        <w:t>Question: {question}</w:t>
+        <w:br/>
+        <w:br/>
+        <w:t>Answer:"""</w:t>
+        <w:br/>
+        <w:t>)</w:t>
+      </w:r>
+    </w:p>
+    <w:p>
+      <w:r>
+        <w:rPr>
+          <w:b/>
+        </w:rPr>
+        <w:t>Screenshot 1: Task Prompt &amp; Agent Response</w:t>
+      </w:r>
+    </w:p>
+    <w:p>
+      <w:pPr>
+        <w:spacing w:after="120"/>
+        <w:ind w:left="360"/>
+      </w:pPr>
+      <w:r>
+        <w:t>[Screenshot 3.1: VSCode window showing agent prompt &amp; response for grounded citation prompt design with FAU ID Z23815316 visible]</w:t>
+        <w:br/>
+        <w:t>[Paste Image Here]</w:t>
+      </w:r>
+    </w:p>
+    <w:p>
+      <w:r>
+        <w:rPr>
+          <w:b/>
+        </w:rPr>
+        <w:t>Screenshot 2: Code Implementation / Execution</w:t>
+      </w:r>
+    </w:p>
+    <w:p>
+      <w:pPr>
+        <w:spacing w:after="240"/>
+        <w:ind w:left="360"/>
+      </w:pPr>
+      <w:r>
+        <w:t>[Screenshot 3.2: VSCode window showing app.py citation generation and in-line citations with FAU ID Z23815316 visible]</w:t>
+        <w:br/>
+        <w:t>[Paste Image Here]</w:t>
+      </w:r>
+    </w:p>
+    <w:p>
+      <w:pPr>
+        <w:pStyle w:val="Heading3"/>
+        <w:spacing w:before="280" w:after="80"/>
+      </w:pPr>
+      <w:r>
+        <w:t>Task 4: Vector Database Ingestion and Multimodal Dataset Testing</w:t>
+      </w:r>
+    </w:p>
+    <w:p>
+      <w:r>
+        <w:rPr>
+          <w:b/>
+        </w:rPr>
+        <w:t>Task Prompt Given to the Agent:</w:t>
+      </w:r>
+    </w:p>
+    <w:p>
+      <w:pPr>
+        <w:spacing w:after="80"/>
+        <w:ind w:left="360"/>
+      </w:pPr>
+      <w:r>
+        <w:t>Update the Chroma database loading script (07_rag_loaddb.py) to ingest the new structured notes and JSON datasets using ResearchNoteLoader, with Vertex AI embeddings and 20-chunk batching to prevent API rate limits.</w:t>
+      </w:r>
+    </w:p>
+    <w:p>
+      <w:r>
+        <w:rPr>
+          <w:b/>
+        </w:rPr>
+        <w:t>Agent Response Summary:</w:t>
+      </w:r>
+    </w:p>
+    <w:p>
+      <w:pPr>
+        <w:spacing w:after="80"/>
+        <w:ind w:left="360"/>
+      </w:pPr>
+      <w:r>
+        <w:t>Updated 07_rag_loaddb.py to import ResearchNoteLoader, configured load_notes() and load_json(), implemented 20-chunk batching to avoid Vertex AI 429 quota exhaustion, and integrated rate-limited Wikipedia loading.</w:t>
+      </w:r>
+    </w:p>
+    <w:p>
+      <w:r>
+        <w:rPr>
+          <w:b/>
+        </w:rPr>
+        <w:t>Generated / Modified Code:</w:t>
+      </w:r>
+    </w:p>
+    <w:p>
+      <w:pPr>
+        <w:ind w:left="360"/>
+      </w:pPr>
+      <w:r>
+        <w:t>Top lines of ingestion methods in HW2/07_rag_loaddb.py:</w:t>
+      </w:r>
+    </w:p>
+    <w:p>
+      <w:pPr>
+        <w:spacing w:after="120"/>
+        <w:ind w:left="720"/>
+      </w:pPr>
+      <w:r>
+        <w:rPr>
+          <w:rFonts w:ascii="Courier New" w:hAnsi="Courier New"/>
+          <w:sz w:val="19"/>
+        </w:rPr>
+        <w:t>def load_notes(directory):</w:t>
+        <w:br/>
+        <w:t xml:space="preserve">    """Load structured research notes using custom ResearchNoteLoader."""</w:t>
+        <w:br/>
+        <w:t xml:space="preserve">    if os.path.exists(directory):</w:t>
+        <w:br/>
+        <w:t xml:space="preserve">        loader = ResearchNoteLoader(directory, glob_pattern="**/*.md")</w:t>
+        <w:br/>
+        <w:t xml:space="preserve">        load_docs(loader.load())</w:t>
+        <w:br/>
+        <w:br/>
+        <w:t>def load_json(directory):</w:t>
+        <w:br/>
+        <w:t xml:space="preserve">    """Load structured JSON datasets using custom ResearchNoteLoader."""</w:t>
+        <w:br/>
+        <w:t xml:space="preserve">    if os.path.exists(directory):</w:t>
+        <w:br/>
+        <w:t xml:space="preserve">        loader = ResearchNoteLoader(directory, glob_pattern="**/*.[jJ][sS][oO][nN]")</w:t>
+        <w:br/>
+        <w:t xml:space="preserve">        load_docs(loader.load())</w:t>
+      </w:r>
+    </w:p>
+    <w:p>
+      <w:r>
+        <w:rPr>
+          <w:b/>
+        </w:rPr>
+        <w:t>Screenshot 1: Task Prompt &amp; Agent Response</w:t>
+      </w:r>
+    </w:p>
+    <w:p>
+      <w:pPr>
+        <w:spacing w:after="120"/>
+        <w:ind w:left="360"/>
+      </w:pPr>
+      <w:r>
+        <w:t>[Screenshot 4.1: VSCode window showing agent prompt &amp; response for vector database ingestion with FAU ID Z23815316 visible]</w:t>
+        <w:br/>
+        <w:t>[Paste Image Here]</w:t>
+      </w:r>
+    </w:p>
+    <w:p>
+      <w:r>
+        <w:rPr>
+          <w:b/>
+        </w:rPr>
+        <w:t>Screenshot 2: Code Implementation / Execution</w:t>
+      </w:r>
+    </w:p>
+    <w:p>
+      <w:pPr>
+        <w:spacing w:after="240"/>
+        <w:ind w:left="360"/>
+      </w:pPr>
+      <w:r>
+        <w:t>[Screenshot 4.2: VSCode window showing 07_rag_loaddb.py and terminal indexing output with FAU ID Z23815316 visible]</w:t>
+        <w:br/>
+        <w:t>[Paste Image Here]</w:t>
       </w:r>
     </w:p>
     <w:sectPr>

</xml_diff>

<commit_message>
docs(HW2): Simplify feature descriptions and task documentation for high-school level clarity
</commit_message>
<xml_diff>
--- a/HW2/hw2-Z23815316.docx
+++ b/HW2/hw2-Z23815316.docx
@@ -396,7 +396,7 @@
         <w:rPr/>
       </w:pPr>
       <w:r>
-        <w:t>Application Description: SmartNotebook RAG is a custom LangChain research assistant modeled after Google NotebookLM. The application augments the baseline RAG pipeline with two primary features: (1) Feature 1 - Custom Document Loader (ResearchNoteLoader): A custom document loader extending LangChain's BaseLoader that parses both structured JSON datasets (tabular records, economic statistics, international airports) and Markdown research notes with YAML frontmatter metadata. (2) Feature 2 - Grounded Q&amp;A with Strict In-Line Citations: A NotebookLM-style question-answering architecture that strictly enforces factual grounding in the retrieved documents, appends in-line bracketed citations ([Source: filename]) to every claim, and provides a verified list of cited sources. The system is accessible via an interactive command-line interface (CLI) and a web chat interface powered by Chainlit.</w:t>
+        <w:t>Application Description: SmartNotebook RAG is an AI study assistant, similar to Google NotebookLM. It lets you ask questions about your documents and notes, and the AI answers using only the facts in those files. The app adds two main features: (1) Feature 1 - Custom Note and Data Reader (ResearchNoteLoader): A custom file reader that reads both study notes (extracting tags like title, author, and date) and organized JSON data files (such as tables of airports or economic data). (2) Feature 2 - Grounded Answers with Source Citations: The AI is restricted to only use facts from the uploaded documents (no making things up). For every fact it gives, it adds an in-line tag like [Source: filename] and lists all the sources it used.</w:t>
       </w:r>
     </w:p>
     <w:p>
@@ -427,7 +427,7 @@
         <w:spacing w:before="280" w:after="80"/>
       </w:pPr>
       <w:r>
-        <w:t>Task 1: Project Setup and Repository Infrastructure</w:t>
+        <w:t>Task 1: Setting Up the Project and Folder Structure</w:t>
       </w:r>
     </w:p>
     <w:p>
@@ -444,7 +444,7 @@
         <w:ind w:left="360"/>
       </w:pPr>
       <w:r>
-        <w:t>Configure a dedicated HW2 directory within the gensec-code repository with virtual environment isolation, .gitignore rules for vector databases (.chromadb) and caches, and install all required LangChain, ChromaDB, and Google Vertex AI dependencies.</w:t>
+        <w:t>Set up a clean HW2 project folder with a virtual environment and a list of required packages so our RAG study app can run smoothly without conflicts.</w:t>
       </w:r>
     </w:p>
     <w:p>
@@ -461,7 +461,7 @@
         <w:ind w:left="360"/>
       </w:pPr>
       <w:r>
-        <w:t>Initialized the HW2 package structure. Configured requirements.txt with langchain, langchain-chroma, langchain-google-vertexai, and document loaders. Set up .gitignore to prevent local database artifacts and system files from being committed.</w:t>
+        <w:t>Created the HW2 folder, added requirements.txt with the needed libraries (LangChain, Chroma, and Vertex AI), and configured .gitignore so temporary test files and databases stay out of the repository.</w:t>
       </w:r>
     </w:p>
     <w:p>
@@ -477,7 +477,7 @@
         <w:ind w:left="360"/>
       </w:pPr>
       <w:r>
-        <w:t>Top lines of HW2/requirements.txt and environment configuration:</w:t>
+        <w:t>Top lines of HW2/requirements.txt:</w:t>
       </w:r>
     </w:p>
     <w:p>
@@ -521,7 +521,7 @@
         <w:ind w:left="360"/>
       </w:pPr>
       <w:r>
-        <w:t>[Screenshot 1.1: VSCode window showing agent prompt &amp; response for repository and dependency setup with FAU ID Z23815316 visible]</w:t>
+        <w:t>[Screenshot 1.1: VSCode window showing agent prompt &amp; response for project setup with FAU ID Z23815316 visible]</w:t>
         <w:br/>
         <w:t>[Paste Image Here]</w:t>
       </w:r>
@@ -551,7 +551,7 @@
         <w:spacing w:before="280" w:after="80"/>
       </w:pPr>
       <w:r>
-        <w:t>Task 2: Feature 1 — Custom Document Loader (ResearchNoteLoader)</w:t>
+        <w:t>Task 2: Feature 1 — Custom Note and Data Reader (ResearchNoteLoader)</w:t>
       </w:r>
     </w:p>
     <w:p>
@@ -568,7 +568,7 @@
         <w:ind w:left="360"/>
       </w:pPr>
       <w:r>
-        <w:t>Create a custom LangChain document loader extending BaseLoader that loads and parses both structured JSON datasets (tables, economic data, airport directories) and Markdown research notes containing YAML frontmatter metadata (title, author, topic, tags, date). Include unit tests.</w:t>
+        <w:t>Build a custom file reader that can read study notes written in Markdown (with headers like author, title, and date) and organized tables stored in JSON files. Also write tests to prove that it works correctly.</w:t>
       </w:r>
     </w:p>
     <w:p>
@@ -585,7 +585,7 @@
         <w:ind w:left="360"/>
       </w:pPr>
       <w:r>
-        <w:t>Implemented ResearchNoteLoader in notebook_loader.py extending langchain_core.document_loaders.BaseLoader. Added regex frontmatter extraction and structured JSON record parsing. Created test_notebook_loader.py with automated unit tests verifying frontmatter metadata extraction, directory batch loading, and JSON table conversion.</w:t>
+        <w:t>Built ResearchNoteLoader in notebook_loader.py. It automatically reads note headers (title, author, tags) and converts JSON data into readable documents for the AI. Also created test_notebook_loader.py with unit tests that all pass.</w:t>
       </w:r>
     </w:p>
     <w:p>
@@ -648,7 +648,7 @@
         <w:ind w:left="360"/>
       </w:pPr>
       <w:r>
-        <w:t>[Screenshot 2.1: VSCode window showing agent prompt &amp; response for custom loader implementation with FAU ID Z23815316 visible]</w:t>
+        <w:t>[Screenshot 2.1: VSCode window showing agent prompt &amp; response for custom file reader with FAU ID Z23815316 visible]</w:t>
         <w:br/>
         <w:t>[Paste Image Here]</w:t>
       </w:r>
@@ -678,7 +678,7 @@
         <w:spacing w:before="280" w:after="80"/>
       </w:pPr>
       <w:r>
-        <w:t>Task 3: Feature 2 — Grounded Q&amp;A with Strict In-Line Citations</w:t>
+        <w:t>Task 3: Feature 2 — Grounded Answers with Source Citations</w:t>
       </w:r>
     </w:p>
     <w:p>
@@ -695,7 +695,7 @@
         <w:ind w:left="360"/>
       </w:pPr>
       <w:r>
-        <w:t>Implement a NotebookLM-style question-answering architecture that strictly grounds responses in retrieved document passages, appends in-line citations [Source: filename] to every claim, and provides a verified list of cited sources.</w:t>
+        <w:t>Make the AI answer questions using ONLY facts from the retrieved document snippets (no guessing or making things up). Have it put a citation like [Source: filename] after every fact, and print a list of sources used.</w:t>
       </w:r>
     </w:p>
     <w:p>
@@ -712,7 +712,7 @@
         <w:ind w:left="360"/>
       </w:pPr>
       <w:r>
-        <w:t>Implemented NotebookRAGService in app.py. Designed a grounded prompt template that enforces fact retrieval strictly from context chunks, formats every claim with [Source: filename], and extracts unique cited sources. Added resilient Chroma vectorstore imports with fallback.</w:t>
+        <w:t>Created the question-answering logic in app.py. Designed a prompt that forces the AI to stick to the facts in the text passages, cite the source name in brackets for each fact, and display a Sources Cited list at the end of every answer.</w:t>
       </w:r>
     </w:p>
     <w:p>
@@ -728,7 +728,7 @@
         <w:ind w:left="360"/>
       </w:pPr>
       <w:r>
-        <w:t>Top lines of Feature 2 citation logic in HW2/app.py:</w:t>
+        <w:t>Citation prompt template in HW2/app.py:</w:t>
       </w:r>
     </w:p>
     <w:p>
@@ -781,7 +781,7 @@
         <w:ind w:left="360"/>
       </w:pPr>
       <w:r>
-        <w:t>[Screenshot 3.1: VSCode window showing agent prompt &amp; response for grounded citation prompt design with FAU ID Z23815316 visible]</w:t>
+        <w:t>[Screenshot 3.1: VSCode window showing agent prompt &amp; response for citation instructions with FAU ID Z23815316 visible]</w:t>
         <w:br/>
         <w:t>[Paste Image Here]</w:t>
       </w:r>
@@ -811,7 +811,7 @@
         <w:spacing w:before="280" w:after="80"/>
       </w:pPr>
       <w:r>
-        <w:t>Task 4: Vector Database Ingestion and Multimodal Dataset Testing</w:t>
+        <w:t>Task 4: Loading All Notes and Data into the Search Database</w:t>
       </w:r>
     </w:p>
     <w:p>
@@ -828,7 +828,7 @@
         <w:ind w:left="360"/>
       </w:pPr>
       <w:r>
-        <w:t>Update the Chroma database loading script (07_rag_loaddb.py) to ingest the new structured notes and JSON datasets using ResearchNoteLoader, with Vertex AI embeddings and 20-chunk batching to prevent API rate limits.</w:t>
+        <w:t>Update the database loader (07_rag_loaddb.py) so it loads all our new notes and JSON datasets using our custom reader. Break the files into small batches so we do not hit Google Cloud quota limits.</w:t>
       </w:r>
     </w:p>
     <w:p>
@@ -845,7 +845,7 @@
         <w:ind w:left="360"/>
       </w:pPr>
       <w:r>
-        <w:t>Updated 07_rag_loaddb.py to import ResearchNoteLoader, configured load_notes() and load_json(), implemented 20-chunk batching to avoid Vertex AI 429 quota exhaustion, and integrated rate-limited Wikipedia loading.</w:t>
+        <w:t>Updated 07_rag_loaddb.py to use ResearchNoteLoader for the notes and JSON folders. Set up batching of 20 pieces at a time so all files are stored into Chroma database smoothly without running into errors.</w:t>
       </w:r>
     </w:p>
     <w:p>
@@ -861,7 +861,7 @@
         <w:ind w:left="360"/>
       </w:pPr>
       <w:r>
-        <w:t>Top lines of ingestion methods in HW2/07_rag_loaddb.py:</w:t>
+        <w:t>Loading methods in HW2/07_rag_loaddb.py:</w:t>
       </w:r>
     </w:p>
     <w:p>
@@ -910,7 +910,7 @@
         <w:ind w:left="360"/>
       </w:pPr>
       <w:r>
-        <w:t>[Screenshot 4.1: VSCode window showing agent prompt &amp; response for vector database ingestion with FAU ID Z23815316 visible]</w:t>
+        <w:t>[Screenshot 4.1: VSCode window showing agent prompt &amp; response for loading documents with FAU ID Z23815316 visible]</w:t>
         <w:br/>
         <w:t>[Paste Image Here]</w:t>
       </w:r>
@@ -929,7 +929,7 @@
         <w:ind w:left="360"/>
       </w:pPr>
       <w:r>
-        <w:t>[Screenshot 4.2: VSCode window showing 07_rag_loaddb.py and terminal indexing output with FAU ID Z23815316 visible]</w:t>
+        <w:t>[Screenshot 4.2: VSCode window showing 07_rag_loaddb.py and successful loading output with FAU ID Z23815316 visible]</w:t>
         <w:br/>
         <w:t>[Paste Image Here]</w:t>
       </w:r>

</xml_diff>